<commit_message>
Overhaul room generation and checkpoint room-depth progress
Replace depth-only room generation with a data-driven pipeline backed by SQLite room catalogs, topology planning, and stage-aware room selection. Preplan main and branch paths, carry path metadata into RoomPlan, and guarantee scaled terminal reward chests.

Deepen runtime objectives across ritual, holdout, escort, puzzle, stealth, resource race, and timed extraction rooms with objective entities, HUD/compass/minimap support, reward-tier-aware chest handling, and ritual ward-link plus reliquary payoff behavior.

Add focused tests for topology, room selection, room objectives, chest reward tiers, HUD projection, and player compass targeting, update ignore rules for room-content database artifacts, and record roadmap progress plus next continuation targets in the room-depth plan.
</commit_message>
<xml_diff>
--- a/dungeon ideas.docx
+++ b/dungeon ideas.docx
@@ -4,6 +4,242 @@
   <w:body>
     <w:p>
       <w:r>
+        <w:t>Here are some ideas organized around what tends to make dungeon crawlers most compelling — the ideas range from easy to implement to more ambitious:</w:t>
+      </w:r>
+    </w:p>
+    <w:p>
+      <w:r>
+        <w:rPr>
+          <w:b/>
+          <w:bCs/>
+        </w:rPr>
+        <w:t>Combat depth</w:t>
+      </w:r>
+    </w:p>
+    <w:p>
+      <w:r>
+        <w:t xml:space="preserve">Beyond "enter room, kill things," add mechanics that reward creative play. Status effects (burn, freeze, slow) that interact with terrain — fire spreading across oil-soaked floors, ice slowing movement near frozen pools. Give enemies patrol routes and vision cones so players can avoid or set up ambushes. A simple </w:t>
+      </w:r>
+      <w:proofErr w:type="spellStart"/>
+      <w:r>
+        <w:t>aggro</w:t>
+      </w:r>
+      <w:proofErr w:type="spellEnd"/>
+      <w:r>
+        <w:t xml:space="preserve"> system where noise from one room attracts enemies in adjacent rooms adds real tension.</w:t>
+      </w:r>
+    </w:p>
+    <w:p>
+      <w:r>
+        <w:rPr>
+          <w:b/>
+          <w:bCs/>
+        </w:rPr>
+        <w:t>Room objectives beyond clearing</w:t>
+      </w:r>
+    </w:p>
+    <w:p>
+      <w:r>
+        <w:t>Not every room should just be "kill everything." Mix in rooms with:</w:t>
+      </w:r>
+    </w:p>
+    <w:p>
+      <w:pPr>
+        <w:numPr>
+          <w:ilvl w:val="0"/>
+          <w:numId w:val="14"/>
+        </w:numPr>
+      </w:pPr>
+      <w:r>
+        <w:t>A crumbling floor that collapses after 10 seconds unless the player escapes to a pressure plate</w:t>
+      </w:r>
+    </w:p>
+    <w:p>
+      <w:pPr>
+        <w:numPr>
+          <w:ilvl w:val="0"/>
+          <w:numId w:val="14"/>
+        </w:numPr>
+      </w:pPr>
+      <w:r>
+        <w:t xml:space="preserve">A prisoner to free before enemies </w:t>
+      </w:r>
+      <w:proofErr w:type="gramStart"/>
+      <w:r>
+        <w:t>execute</w:t>
+      </w:r>
+      <w:proofErr w:type="gramEnd"/>
+      <w:r>
+        <w:t xml:space="preserve"> them</w:t>
+      </w:r>
+    </w:p>
+    <w:p>
+      <w:pPr>
+        <w:numPr>
+          <w:ilvl w:val="0"/>
+          <w:numId w:val="14"/>
+        </w:numPr>
+      </w:pPr>
+      <w:r>
+        <w:t>A ritual the player must interrupt by destroying altar pieces while being swarmed</w:t>
+      </w:r>
+    </w:p>
+    <w:p>
+      <w:pPr>
+        <w:numPr>
+          <w:ilvl w:val="0"/>
+          <w:numId w:val="14"/>
+        </w:numPr>
+      </w:pPr>
+      <w:r>
+        <w:t>A timed chest that locks if you take too long — rewards for fast play</w:t>
+      </w:r>
+    </w:p>
+    <w:p>
+      <w:r>
+        <w:rPr>
+          <w:b/>
+          <w:bCs/>
+        </w:rPr>
+        <w:t>Interconnected room economy</w:t>
+      </w:r>
+    </w:p>
+    <w:p>
+      <w:r>
+        <w:t>Give rooms memory. A "cursed shrine" room you ignored two rooms ago could have a wandering curse that starts draining your health. Enemies in connected rooms can reinforce each other if alarms are triggered. This makes the dungeon feel like a place rather than a series of isolated encounters.</w:t>
+      </w:r>
+    </w:p>
+    <w:p>
+      <w:r>
+        <w:rPr>
+          <w:b/>
+          <w:bCs/>
+        </w:rPr>
+        <w:t>Player power decisions</w:t>
+      </w:r>
+    </w:p>
+    <w:p>
+      <w:r>
+        <w:t>The treasure chest is a great hook — expand it into a resource web. Let players find runes that modify their abilities, but with trade-offs (deal 50% more damage but move slower). Shrines that offer a powerful buff alongside a permanent debuff. This creates meaningful decisions and character-to-character variety.</w:t>
+      </w:r>
+    </w:p>
+    <w:p>
+      <w:r>
+        <w:rPr>
+          <w:b/>
+          <w:bCs/>
+        </w:rPr>
+        <w:t>Environmental storytelling and mystery</w:t>
+      </w:r>
+    </w:p>
+    <w:p>
+      <w:r>
+        <w:t>Scatter environmental clues about the portal room's location — footprints, sounds through walls, a compass that spins wildly near the portal. Give rooms narrative flavor: a room with a skeleton and a journal entry, or enemy camps with supplies suggesting they were hunting something. Players stay engaged when they feel like they're discovering a story, not just clearing a dungeon.</w:t>
+      </w:r>
+    </w:p>
+    <w:p>
+      <w:r>
+        <w:rPr>
+          <w:b/>
+          <w:bCs/>
+        </w:rPr>
+        <w:lastRenderedPageBreak/>
+        <w:t>Meta-progression</w:t>
+      </w:r>
+    </w:p>
+    <w:p>
+      <w:r>
+        <w:t xml:space="preserve">Single runs can feel </w:t>
+      </w:r>
+      <w:proofErr w:type="gramStart"/>
+      <w:r>
+        <w:t>low-stakes</w:t>
+      </w:r>
+      <w:proofErr w:type="gramEnd"/>
+      <w:r>
+        <w:t>. A persistent meta-layer fixes this — unlockable starting items, new character classes, passive perks that carry over. Even something simple like "unlock a starting health potion after your first 5 runs" keeps players coming back.</w:t>
+      </w:r>
+    </w:p>
+    <w:p>
+      <w:r>
+        <w:t xml:space="preserve">Here's a visual overview of how these systems </w:t>
+      </w:r>
+      <w:proofErr w:type="spellStart"/>
+      <w:proofErr w:type="gramStart"/>
+      <w:r>
+        <w:t>interconnect:You</w:t>
+      </w:r>
+      <w:proofErr w:type="spellEnd"/>
+      <w:proofErr w:type="gramEnd"/>
+      <w:r>
+        <w:t xml:space="preserve"> can click any node to dig deeper into a specific system. The key design principle </w:t>
+      </w:r>
+      <w:proofErr w:type="gramStart"/>
+      <w:r>
+        <w:t>tying</w:t>
+      </w:r>
+      <w:proofErr w:type="gramEnd"/>
+      <w:r>
+        <w:t xml:space="preserve"> </w:t>
+      </w:r>
+      <w:proofErr w:type="gramStart"/>
+      <w:r>
+        <w:t>all of</w:t>
+      </w:r>
+      <w:proofErr w:type="gramEnd"/>
+      <w:r>
+        <w:t xml:space="preserve"> this together: each layer should make the other layers feel more meaningful. A rune choice matters more if the next room has a timer. The timer matters more if a failed run costs you a streak bonus. Stack the systems and the simple act of "entering a room" starts feeling like a tactical decision.</w:t>
+      </w:r>
+    </w:p>
+    <w:p>
+      <w:r>
+        <w:drawing>
+          <wp:inline distT="0" distB="0" distL="0" distR="0" wp14:anchorId="0E90F10B" wp14:editId="41102AF7">
+            <wp:extent cx="5943600" cy="4223385"/>
+            <wp:effectExtent l="0" t="0" r="0" b="0"/>
+            <wp:docPr id="1674511017" name="Picture 1"/>
+            <wp:cNvGraphicFramePr>
+              <a:graphicFrameLocks xmlns:a="http://schemas.openxmlformats.org/drawingml/2006/main" noChangeAspect="1"/>
+            </wp:cNvGraphicFramePr>
+            <a:graphic xmlns:a="http://schemas.openxmlformats.org/drawingml/2006/main">
+              <a:graphicData uri="http://schemas.openxmlformats.org/drawingml/2006/picture">
+                <pic:pic xmlns:pic="http://schemas.openxmlformats.org/drawingml/2006/picture">
+                  <pic:nvPicPr>
+                    <pic:cNvPr id="1674511017" name=""/>
+                    <pic:cNvPicPr/>
+                  </pic:nvPicPr>
+                  <pic:blipFill>
+                    <a:blip r:embed="rId5"/>
+                    <a:stretch>
+                      <a:fillRect/>
+                    </a:stretch>
+                  </pic:blipFill>
+                  <pic:spPr>
+                    <a:xfrm>
+                      <a:off x="0" y="0"/>
+                      <a:ext cx="5943600" cy="4223385"/>
+                    </a:xfrm>
+                    <a:prstGeom prst="rect">
+                      <a:avLst/>
+                    </a:prstGeom>
+                  </pic:spPr>
+                </pic:pic>
+              </a:graphicData>
+            </a:graphic>
+          </wp:inline>
+        </w:drawing>
+      </w:r>
+    </w:p>
+    <w:p>
+      <w:pPr>
+        <w:pBdr>
+          <w:bottom w:val="single" w:sz="6" w:space="1" w:color="auto"/>
+        </w:pBdr>
+      </w:pPr>
+    </w:p>
+    <w:p/>
+    <w:p>
+      <w:r>
         <w:t>Here are objective types organized by what makes each one interesting mechanically:</w:t>
       </w:r>
     </w:p>
@@ -16,7 +252,11 @@
         <w:t>Escort and protection</w:t>
       </w:r>
       <w:r>
-        <w:t xml:space="preserve"> A fragile NPC — a wounded scholar, a captured merchant — must reach the room's exit while you fight. The NPC moves on their own (slowly, stupidly) and enemies prioritize them over you. The tension comes from splitting attention: do you chase down the enemies targeting the NPC, or hold a chokepoint? Variant: the NPC is a </w:t>
+        <w:t xml:space="preserve"> A fragile NPC — a wounded scholar, a captured merchant — must reach the room's exit while you fight. The NPC moves on their own (slowly, stupidly) and enemies prioritize them over you. The tension comes from splitting attention: do you chase </w:t>
+      </w:r>
+      <w:r>
+        <w:lastRenderedPageBreak/>
+        <w:t xml:space="preserve">down the enemies targeting the NPC, or hold a chokepoint? Variant: the NPC is a </w:t>
       </w:r>
       <w:r>
         <w:rPr>
@@ -38,7 +278,15 @@
         <w:t>Puzzle-gated doors</w:t>
       </w:r>
       <w:r>
-        <w:t xml:space="preserve"> The exit is locked and the room contains a spatial puzzle — pressure plates that must be held simultaneously, mirrors that redirect a beam to a crystal, barrels that must be pushed onto floor markers. Enemies still spawn, so the player is solving the puzzle under fire. The key design rule: the puzzle solution should be visible from the start; the difficulty is executing it with enemies attacking.</w:t>
+        <w:t xml:space="preserve"> </w:t>
+      </w:r>
+      <w:proofErr w:type="gramStart"/>
+      <w:r>
+        <w:t>The</w:t>
+      </w:r>
+      <w:proofErr w:type="gramEnd"/>
+      <w:r>
+        <w:t xml:space="preserve"> exit is locked and the room contains a spatial puzzle — pressure plates that must be held simultaneously, mirrors that redirect a beam to a crystal, barrels that must be pushed onto floor markers. Enemies still spawn, so the player is solving the puzzle under fire. The key design rule: the puzzle solution should be visible from the start; the difficulty is executing it with enemies attacking.</w:t>
       </w:r>
     </w:p>
     <w:p>
@@ -50,7 +298,15 @@
         <w:t>Survival / holdout</w:t>
       </w:r>
       <w:r>
-        <w:t xml:space="preserve"> No kill condition — the player just has to survive until a timer expires. A portal, a ritual, a beacon. Works best when the room has defensive terrain (barricades, chokepoints) and the enemy spawn rate escalates. The psychological shift from "kill everything" to "just don't die" changes how players move and think entirely.</w:t>
+        <w:t xml:space="preserve"> No kill condition — the player just </w:t>
+      </w:r>
+      <w:proofErr w:type="gramStart"/>
+      <w:r>
+        <w:t>has to</w:t>
+      </w:r>
+      <w:proofErr w:type="gramEnd"/>
+      <w:r>
+        <w:t xml:space="preserve"> survive until a timer expires. A portal, a ritual, a beacon. Works best when the room has defensive terrain (barricades, chokepoints) and the enemy spawn rate escalates. The psychological shift from "kill everything" to "just don't die" changes how players move and think entirely.</w:t>
       </w:r>
     </w:p>
     <w:p>
@@ -62,7 +318,15 @@
         <w:t>Ritual disruption</w:t>
       </w:r>
       <w:r>
-        <w:t xml:space="preserve"> Enemies are performing a ritual at one or more altars. Interrupt it by destroying the altars, but each destroyed altar enrages the remaining enemies (speed boost, more spawns, damage increase). Players have to decide the order of disruption — do you kill the altar that's nearly complete first, or take out the one with the weakest guards? This creates a genuine tactical read of the room before engaging.</w:t>
+        <w:t xml:space="preserve"> Enemies are performing a ritual at one or more altars. Interrupt it by destroying the altars, but each destroyed altar enrages the remaining enemies (speed boost, more spawns, damage increase). Players </w:t>
+      </w:r>
+      <w:proofErr w:type="gramStart"/>
+      <w:r>
+        <w:t>have to</w:t>
+      </w:r>
+      <w:proofErr w:type="gramEnd"/>
+      <w:r>
+        <w:t xml:space="preserve"> decide the order of disruption — do you kill the altar that's nearly complete first, or take out the one with the weakest guards? This creates a genuine tactical read of the room before engaging.</w:t>
       </w:r>
     </w:p>
     <w:p>
@@ -74,7 +338,15 @@
         <w:t>Resource race</w:t>
       </w:r>
       <w:r>
-        <w:t xml:space="preserve"> A chest full of loot sits in the center. Enemies are racing toward it from the other side. Whoever reaches it first claims it — if enemies get there, they destroy it. The player sprints for the chest knowing they're running </w:t>
+        <w:t xml:space="preserve"> A chest full of </w:t>
+      </w:r>
+      <w:proofErr w:type="gramStart"/>
+      <w:r>
+        <w:t>loot</w:t>
+      </w:r>
+      <w:proofErr w:type="gramEnd"/>
+      <w:r>
+        <w:t xml:space="preserve"> sits in the center. Enemies are racing toward it from the other side. Whoever reaches it first claims it — if enemies get there, they destroy it. The player sprints for the chest knowing they're running </w:t>
       </w:r>
       <w:r>
         <w:rPr>
@@ -127,15 +399,15 @@
           <w:b/>
           <w:bCs/>
         </w:rPr>
+        <w:t>Timed extraction</w:t>
+      </w:r>
+      <w:r>
+        <w:t xml:space="preserve"> A valuable object spawns in the room — a relic, a key, a piece of a map — and the player has a limited window to grab it and exit before the room seals permanently. The object might be on the far side of enemies, or past a puzzle element. Miss the window and the run continues, but a powerful upgrade is permanently lost.</w:t>
+      </w:r>
+    </w:p>
+    <w:p>
+      <w:r>
         <w:lastRenderedPageBreak/>
-        <w:t>Timed extraction</w:t>
-      </w:r>
-      <w:r>
-        <w:t xml:space="preserve"> A valuable object spawns in the room — a relic, a key, a piece of a map — and the player has a limited window to grab it and exit before the room seals permanently. The object might be on the far side of enemies, or past a puzzle element. Miss the window and the run continues, but a powerful upgrade is permanently lost.</w:t>
-      </w:r>
-    </w:p>
-    <w:p>
-      <w:r>
         <w:t>Here's how these objectives map to the kinds of tension they create:</w:t>
       </w:r>
     </w:p>
@@ -560,10 +832,51 @@
     <w:p/>
     <w:p>
       <w:r>
-        <w:rPr>
-          <w:b/>
-          <w:bCs/>
-        </w:rPr>
+        <w:drawing>
+          <wp:inline distT="0" distB="0" distL="0" distR="0" wp14:anchorId="65FBBDF0" wp14:editId="6B61C821">
+            <wp:extent cx="5943600" cy="3876040"/>
+            <wp:effectExtent l="0" t="0" r="0" b="0"/>
+            <wp:docPr id="1838381995" name="Picture 1"/>
+            <wp:cNvGraphicFramePr>
+              <a:graphicFrameLocks xmlns:a="http://schemas.openxmlformats.org/drawingml/2006/main" noChangeAspect="1"/>
+            </wp:cNvGraphicFramePr>
+            <a:graphic xmlns:a="http://schemas.openxmlformats.org/drawingml/2006/main">
+              <a:graphicData uri="http://schemas.openxmlformats.org/drawingml/2006/picture">
+                <pic:pic xmlns:pic="http://schemas.openxmlformats.org/drawingml/2006/picture">
+                  <pic:nvPicPr>
+                    <pic:cNvPr id="1838381995" name=""/>
+                    <pic:cNvPicPr/>
+                  </pic:nvPicPr>
+                  <pic:blipFill>
+                    <a:blip r:embed="rId6"/>
+                    <a:stretch>
+                      <a:fillRect/>
+                    </a:stretch>
+                  </pic:blipFill>
+                  <pic:spPr>
+                    <a:xfrm>
+                      <a:off x="0" y="0"/>
+                      <a:ext cx="5943600" cy="3876040"/>
+                    </a:xfrm>
+                    <a:prstGeom prst="rect">
+                      <a:avLst/>
+                    </a:prstGeom>
+                  </pic:spPr>
+                </pic:pic>
+              </a:graphicData>
+            </a:graphic>
+          </wp:inline>
+        </w:drawing>
+      </w:r>
+    </w:p>
+    <w:p/>
+    <w:p>
+      <w:r>
+        <w:rPr>
+          <w:b/>
+          <w:bCs/>
+        </w:rPr>
+        <w:lastRenderedPageBreak/>
         <w:t>How to use this for pacing</w:t>
       </w:r>
     </w:p>
@@ -584,16 +897,23 @@
         </w:pBdr>
       </w:pPr>
       <w:r>
-        <w:t>The stealth room is worth special attention as a "wildcard" — it's the one objective that actively punishes certain rune builds (movement-penalty runes, noisy abilities) while rewarding others. That's a rare opportunity to make the rune system feel like it has real world consequences, which deepens both systems at once.</w:t>
-      </w:r>
-    </w:p>
-    <w:p>
-      <w:r>
-        <w:rPr>
-          <w:b/>
-          <w:bCs/>
-        </w:rPr>
-        <w:lastRenderedPageBreak/>
+        <w:t>The stealth room is worth special attention as a "</w:t>
+      </w:r>
+      <w:proofErr w:type="gramStart"/>
+      <w:r>
+        <w:t>wildcard" —</w:t>
+      </w:r>
+      <w:proofErr w:type="gramEnd"/>
+      <w:r>
+        <w:t xml:space="preserve"> it's the one objective that actively punishes certain rune builds (movement-penalty runes, noisy abilities) while rewarding others. That's a rare opportunity to make the rune system feel like it has real world consequences, which deepens both systems at once.</w:t>
+      </w:r>
+    </w:p>
+    <w:p>
+      <w:r>
+        <w:rPr>
+          <w:b/>
+          <w:bCs/>
+        </w:rPr>
         <w:t>The core design principle: meaningful asymmetry</w:t>
       </w:r>
     </w:p>
@@ -619,7 +939,15 @@
         <w:t>worse at something you'd otherwise rely on</w:t>
       </w:r>
       <w:r>
-        <w:t>. Avoid "strictly better" runes — they eliminate decisions. The best trade-offs force players to adapt their playstyle, not just pick the highest number.</w:t>
+        <w:t xml:space="preserve">. Avoid "strictly better" </w:t>
+      </w:r>
+      <w:proofErr w:type="gramStart"/>
+      <w:r>
+        <w:t>runes —</w:t>
+      </w:r>
+      <w:proofErr w:type="gramEnd"/>
+      <w:r>
+        <w:t xml:space="preserve"> they eliminate decisions. The best trade-offs force players to adapt their playstyle, not just pick the highest number.</w:t>
       </w:r>
     </w:p>
     <w:p>
@@ -633,7 +961,15 @@
     </w:p>
     <w:p>
       <w:r>
-        <w:t>Think in tiers of impact scope:</w:t>
+        <w:t xml:space="preserve">Think in </w:t>
+      </w:r>
+      <w:proofErr w:type="gramStart"/>
+      <w:r>
+        <w:t>tiers</w:t>
+      </w:r>
+      <w:proofErr w:type="gramEnd"/>
+      <w:r>
+        <w:t xml:space="preserve"> of impact scope:</w:t>
       </w:r>
     </w:p>
     <w:p>
@@ -642,10 +978,22 @@
           <w:i/>
           <w:iCs/>
         </w:rPr>
-        <w:t>Stat runes</w:t>
-      </w:r>
-      <w:r>
-        <w:t xml:space="preserve"> — simple numerical trade-offs. Easy to understand, easy to balance. Good as common drops.</w:t>
+        <w:t xml:space="preserve">Stat </w:t>
+      </w:r>
+      <w:proofErr w:type="gramStart"/>
+      <w:r>
+        <w:rPr>
+          <w:i/>
+          <w:iCs/>
+        </w:rPr>
+        <w:t>runes</w:t>
+      </w:r>
+      <w:r>
+        <w:t xml:space="preserve"> —</w:t>
+      </w:r>
+      <w:proofErr w:type="gramEnd"/>
+      <w:r>
+        <w:t xml:space="preserve"> simple numerical trade-offs. Easy to understand, easy to balance. Good as common drops.</w:t>
       </w:r>
     </w:p>
     <w:p>
@@ -742,6 +1090,7 @@
           <w:i/>
           <w:iCs/>
         </w:rPr>
+        <w:lastRenderedPageBreak/>
         <w:t>Identity runes</w:t>
       </w:r>
       <w:r>
@@ -756,7 +1105,15 @@
         </w:numPr>
       </w:pPr>
       <w:r>
-        <w:t>You deal no damage. Enemies kill each other when they collide. Your job is to herd them.</w:t>
+        <w:t xml:space="preserve">You </w:t>
+      </w:r>
+      <w:proofErr w:type="gramStart"/>
+      <w:r>
+        <w:t>deal</w:t>
+      </w:r>
+      <w:proofErr w:type="gramEnd"/>
+      <w:r>
+        <w:t xml:space="preserve"> no damage. Enemies kill each other when they collide. Your job is to herd them.</w:t>
       </w:r>
     </w:p>
     <w:p>
@@ -792,7 +1149,15 @@
     </w:p>
     <w:p>
       <w:r>
-        <w:t xml:space="preserve">Give players a fixed number of rune slots (3–5 works well). This creates a combinatorics puzzle — which runes interact well together? Design some runes to </w:t>
+        <w:t xml:space="preserve">Give players a fixed number of rune slots (3–5 works well). This creates a combinatorics puzzle — which </w:t>
+      </w:r>
+      <w:proofErr w:type="gramStart"/>
+      <w:r>
+        <w:t>runes</w:t>
+      </w:r>
+      <w:proofErr w:type="gramEnd"/>
+      <w:r>
+        <w:t xml:space="preserve"> interact well together? Design some runes to </w:t>
       </w:r>
       <w:r>
         <w:rPr>
@@ -813,7 +1178,15 @@
         </w:numPr>
       </w:pPr>
       <w:r>
-        <w:t>"If you have a movement-penalty rune equipped, gain +80% damage"</w:t>
+        <w:t xml:space="preserve">"If you have a movement-penalty </w:t>
+      </w:r>
+      <w:proofErr w:type="gramStart"/>
+      <w:r>
+        <w:t>rune</w:t>
+      </w:r>
+      <w:proofErr w:type="gramEnd"/>
+      <w:r>
+        <w:t xml:space="preserve"> equipped, gain +80% damage"</w:t>
       </w:r>
     </w:p>
     <w:p>
@@ -829,7 +1202,6 @@
     </w:p>
     <w:p>
       <w:r>
-        <w:lastRenderedPageBreak/>
         <w:t>This rewards players who read their runes carefully rather than just taking the best individual option.</w:t>
       </w:r>
     </w:p>
@@ -885,7 +1257,15 @@
         </w:numPr>
       </w:pPr>
       <w:r>
-        <w:t>Present 3 runes to choose from</w:t>
+        <w:t xml:space="preserve">Present 3 </w:t>
+      </w:r>
+      <w:proofErr w:type="gramStart"/>
+      <w:r>
+        <w:t>runes</w:t>
+      </w:r>
+      <w:proofErr w:type="gramEnd"/>
+      <w:r>
+        <w:t xml:space="preserve"> to choose from</w:t>
       </w:r>
     </w:p>
     <w:p>
@@ -927,8 +1307,13 @@
         </w:numPr>
       </w:pPr>
       <w:r>
-        <w:t>Behavior changes instantly on equip</w:t>
-      </w:r>
+        <w:t xml:space="preserve">Behavior changes instantly on </w:t>
+      </w:r>
+      <w:proofErr w:type="gramStart"/>
+      <w:r>
+        <w:t>equip</w:t>
+      </w:r>
+      <w:proofErr w:type="gramEnd"/>
     </w:p>
     <w:p>
       <w:pPr>
@@ -980,6 +1365,7 @@
         </w:numPr>
       </w:pPr>
       <w:r>
+        <w:lastRenderedPageBreak/>
         <w:t>Prevents players from feeling forced into a bad rune</w:t>
       </w:r>
     </w:p>
@@ -1034,7 +1420,23 @@
         <w:t>how</w:t>
       </w:r>
       <w:r>
-        <w:t xml:space="preserve"> you present rune choices matters as much as the runes themselves:</w:t>
+        <w:t xml:space="preserve"> </w:t>
+      </w:r>
+      <w:proofErr w:type="gramStart"/>
+      <w:r>
+        <w:t>you</w:t>
+      </w:r>
+      <w:proofErr w:type="gramEnd"/>
+      <w:r>
+        <w:t xml:space="preserve"> present rune choices </w:t>
+      </w:r>
+      <w:proofErr w:type="gramStart"/>
+      <w:r>
+        <w:t>matters</w:t>
+      </w:r>
+      <w:proofErr w:type="gramEnd"/>
+      <w:r>
+        <w:t xml:space="preserve"> as much as the runes themselves:</w:t>
       </w:r>
       <w:r>
         <w:t xml:space="preserve"> </w:t>
@@ -1065,8 +1467,15 @@
         </w:numPr>
       </w:pPr>
       <w:r>
-        <w:lastRenderedPageBreak/>
-        <w:t>Earlier rooms: bias toward stat runes (easier to understand when you're still learning the run)</w:t>
+        <w:t xml:space="preserve">Earlier rooms: bias toward </w:t>
+      </w:r>
+      <w:proofErr w:type="gramStart"/>
+      <w:r>
+        <w:t>stat</w:t>
+      </w:r>
+      <w:proofErr w:type="gramEnd"/>
+      <w:r>
+        <w:t xml:space="preserve"> runes (easier to understand when you're still learning the run)</w:t>
       </w:r>
     </w:p>
     <w:p>
@@ -1144,7 +1553,15 @@
         </w:numPr>
       </w:pPr>
       <w:r>
-        <w:t>Give players a 3-second preview window where the rune is "active" but can be cancelled, so they feel the trade-off before committing</w:t>
+        <w:t xml:space="preserve">Give players a 3-second preview window where the </w:t>
+      </w:r>
+      <w:proofErr w:type="gramStart"/>
+      <w:r>
+        <w:t>rune</w:t>
+      </w:r>
+      <w:proofErr w:type="gramEnd"/>
+      <w:r>
+        <w:t xml:space="preserve"> is "active" but can be cancelled, so they feel the trade-off before committing</w:t>
       </w:r>
     </w:p>
     <w:p>
@@ -1174,18 +1591,35 @@
         </w:pBdr>
       </w:pPr>
       <w:r>
-        <w:t>Permanent runes create more tension than removable ones, but consider a middle ground: one "rune swap" token per run, found as a rare drop. Players will hoard it, agonize over when to use it, and feel genuinely rewarded when it bails them out of a bad earlier choice. That agonizing is exactly the engagement you want.</w:t>
-      </w:r>
-    </w:p>
-    <w:p>
-      <w:r>
+        <w:t xml:space="preserve">Permanent runes create more tension than removable </w:t>
+      </w:r>
+      <w:proofErr w:type="gramStart"/>
+      <w:r>
+        <w:t>ones, but</w:t>
+      </w:r>
+      <w:proofErr w:type="gramEnd"/>
+      <w:r>
+        <w:t xml:space="preserve"> consider a middle ground: one "rune swap" token per run, found </w:t>
+      </w:r>
+      <w:proofErr w:type="gramStart"/>
+      <w:r>
+        <w:t>as</w:t>
+      </w:r>
+      <w:proofErr w:type="gramEnd"/>
+      <w:r>
+        <w:t xml:space="preserve"> a rare drop. Players will hoard it, agonize over when to use it, and feel genuinely rewarded when it bails them out of a bad earlier choice. That agonizing is exactly the engagement you want.</w:t>
+      </w:r>
+    </w:p>
+    <w:p>
+      <w:r>
+        <w:lastRenderedPageBreak/>
         <w:t>Combat depth breaks down into three interlocking systems — status effects, terrain, and AI behavior. Here's how to design and implement each one, and crucially, how to make them interact with each other.</w:t>
       </w:r>
     </w:p>
     <w:p>
       <w:r>
         <w:pict w14:anchorId="3C813A4D">
-          <v:rect id="_x0000_i1043" style="width:0;height:1.5pt" o:hralign="center" o:hrstd="t" o:hr="t" fillcolor="#a0a0a0" stroked="f"/>
+          <v:rect id="_x0000_i1025" style="width:0;height:1.5pt" o:hralign="center" o:hrstd="t" o:hr="t" fillcolor="#a0a0a0" stroked="f"/>
         </w:pict>
       </w:r>
     </w:p>
@@ -1255,7 +1689,6 @@
           <w:b/>
           <w:bCs/>
         </w:rPr>
-        <w:lastRenderedPageBreak/>
         <w:t>Burn</w:t>
       </w:r>
       <w:r>
@@ -1277,7 +1710,15 @@
         <w:t>Freeze</w:t>
       </w:r>
       <w:r>
-        <w:t xml:space="preserve"> — reduces movement speed by 60%; a second application fully roots the enemy; a frozen enemy that takes physical damage shatters, dealing AoE damage to nearby enemies</w:t>
+        <w:t xml:space="preserve"> — reduces movement speed by 60%; a second application fully roots the enemy; a frozen enemy that takes physical damage shatters, dealing </w:t>
+      </w:r>
+      <w:proofErr w:type="spellStart"/>
+      <w:r>
+        <w:t>AoE</w:t>
+      </w:r>
+      <w:proofErr w:type="spellEnd"/>
+      <w:r>
+        <w:t xml:space="preserve"> damage to nearby enemies</w:t>
       </w:r>
     </w:p>
     <w:p>
@@ -1305,8 +1746,13 @@
         <w:t>accelerates</w:t>
       </w:r>
       <w:r>
-        <w:t xml:space="preserve"> the longer it's applied; stacks up to 3 times; doesn't kill — leaves enemies at 1 HP, making them trivially finishable</w:t>
-      </w:r>
+        <w:t xml:space="preserve"> the longer it's applied; stacks up to 3 times; doesn't kill — leaves enemies at 1 HP, making them trivially </w:t>
+      </w:r>
+      <w:proofErr w:type="spellStart"/>
+      <w:r>
+        <w:t>finishable</w:t>
+      </w:r>
+      <w:proofErr w:type="spellEnd"/>
     </w:p>
     <w:p>
       <w:pPr>
@@ -1323,7 +1769,15 @@
         <w:t>Stun</w:t>
       </w:r>
       <w:r>
-        <w:t xml:space="preserve"> — complete movement and attack lockout for 1.5 seconds; immune to stun again for 4 seconds after recovery (prevents stunlock)</w:t>
+        <w:t xml:space="preserve"> — complete movement and attack lockout for 1.5 seconds; immune to stun again for 4 seconds after recovery (prevents </w:t>
+      </w:r>
+      <w:proofErr w:type="spellStart"/>
+      <w:r>
+        <w:t>stunlock</w:t>
+      </w:r>
+      <w:proofErr w:type="spellEnd"/>
+      <w:r>
+        <w:t>)</w:t>
       </w:r>
     </w:p>
     <w:p>
@@ -1333,6 +1787,7 @@
           <w:numId w:val="12"/>
         </w:numPr>
       </w:pPr>
+      <w:proofErr w:type="gramStart"/>
       <w:r>
         <w:rPr>
           <w:b/>
@@ -1341,7 +1796,11 @@
         <w:t>Slow</w:t>
       </w:r>
       <w:r>
-        <w:t xml:space="preserve"> — 40% speed reduction; stacks with freeze but doesn't stack with itself; interacts with terrain by making enemies unable to traverse difficult terrain like mud or shallow water</w:t>
+        <w:t xml:space="preserve"> — 40</w:t>
+      </w:r>
+      <w:proofErr w:type="gramEnd"/>
+      <w:r>
+        <w:t>% speed reduction; stacks with freeze but doesn't stack with itself; interacts with terrain by making enemies unable to traverse difficult terrain like mud or shallow water</w:t>
       </w:r>
     </w:p>
     <w:p>
@@ -1373,11 +1832,20 @@
     </w:p>
     <w:p>
       <w:r>
-        <w:t>Define these explicitly in your codebase before building anything else — they're the hardest thing to retrofit:---</w:t>
-      </w:r>
-    </w:p>
-    <w:p>
-      <w:r>
+        <w:t xml:space="preserve">Define these explicitly in your codebase before building anything else — they're the hardest thing to </w:t>
+      </w:r>
+      <w:proofErr w:type="gramStart"/>
+      <w:r>
+        <w:t>retrofit:---</w:t>
+      </w:r>
+      <w:proofErr w:type="gramEnd"/>
+    </w:p>
+    <w:p>
+      <w:r>
+        <w:rPr>
+          <w:noProof/>
+        </w:rPr>
+        <w:lastRenderedPageBreak/>
         <w:drawing>
           <wp:inline distT="0" distB="0" distL="0" distR="0" wp14:anchorId="4C0EB874" wp14:editId="45BDD02B">
             <wp:extent cx="5943600" cy="3634105"/>
@@ -1394,7 +1862,7 @@
                     <pic:cNvPicPr/>
                   </pic:nvPicPr>
                   <pic:blipFill>
-                    <a:blip r:embed="rId5"/>
+                    <a:blip r:embed="rId7"/>
                     <a:stretch>
                       <a:fillRect/>
                     </a:stretch>
@@ -1427,7 +1895,6 @@
           <w:b/>
           <w:bCs/>
         </w:rPr>
-        <w:lastRenderedPageBreak/>
         <w:t>Terrain types and interactions</w:t>
       </w:r>
     </w:p>
@@ -1478,7 +1945,15 @@
         <w:t>Oil slick</w:t>
       </w:r>
       <w:r>
-        <w:t xml:space="preserve"> — no movement penalty on its own; ignites instantly if any fire source touches it, spreading burn in a 3-tile radius; enemies with fire attacks will accidentally ignite it</w:t>
+        <w:t xml:space="preserve"> — no movement penalty on its own; ignites instantly if any fire source touches it, spreading burn in a 3-</w:t>
+      </w:r>
+      <w:proofErr w:type="spellStart"/>
+      <w:r>
+        <w:t>tile</w:t>
+      </w:r>
+      <w:proofErr w:type="spellEnd"/>
+      <w:r>
+        <w:t xml:space="preserve"> radius; enemies with fire attacks will accidentally ignite it</w:t>
       </w:r>
     </w:p>
     <w:p>
@@ -1514,7 +1989,15 @@
         <w:t>Ice</w:t>
       </w:r>
       <w:r>
-        <w:t xml:space="preserve"> — created by freeze hitting water tiles; 30% faster movement (slippery); enemies without ice-adapted AI will slide past their intended position, missing attacks</w:t>
+        <w:t xml:space="preserve"> — created by </w:t>
+      </w:r>
+      <w:proofErr w:type="gramStart"/>
+      <w:r>
+        <w:t>freeze hitting</w:t>
+      </w:r>
+      <w:proofErr w:type="gramEnd"/>
+      <w:r>
+        <w:t xml:space="preserve"> water tiles; 30% faster movement (slippery); enemies without ice-adapted AI will slide past their intended position, missing attacks</w:t>
       </w:r>
     </w:p>
     <w:p>
@@ -1547,6 +2030,7 @@
           <w:b/>
           <w:bCs/>
         </w:rPr>
+        <w:lastRenderedPageBreak/>
         <w:t>Pressure plates</w:t>
       </w:r>
       <w:r>
@@ -1592,13 +2076,21 @@
         <w:t>theme</w:t>
       </w:r>
       <w:r>
-        <w:t xml:space="preserve"> with a dominant type and one or two secondary types. A swamp room is mostly mud and water with some oil slicks near enemy spawn points. A volcanic room is mostly normal floor with lava channels and pressure plates over lava pits. This makes each room readable at a glance and lets players plan before engaging.</w:t>
+        <w:t xml:space="preserve"> with a dominant type and one or two secondary types. A swamp room is mostly mud and water with some oil slicks near enemy spawn points. A volcanic room is mostly normal floor with lava channels and pressure plates over lava pits. This makes each room readable </w:t>
+      </w:r>
+      <w:proofErr w:type="gramStart"/>
+      <w:r>
+        <w:t>at a glance</w:t>
+      </w:r>
+      <w:proofErr w:type="gramEnd"/>
+      <w:r>
+        <w:t xml:space="preserve"> and lets players plan before engaging.</w:t>
       </w:r>
     </w:p>
     <w:p>
       <w:r>
         <w:pict w14:anchorId="44A6713E">
-          <v:rect id="_x0000_i1044" style="width:0;height:1.5pt" o:hralign="center" o:hrstd="t" o:hr="t" fillcolor="#a0a0a0" stroked="f"/>
+          <v:rect id="_x0000_i1026" style="width:0;height:1.5pt" o:hralign="center" o:hrstd="t" o:hr="t" fillcolor="#a0a0a0" stroked="f"/>
         </w:pict>
       </w:r>
     </w:p>
@@ -1628,62 +2120,78 @@
           <w:b/>
           <w:bCs/>
         </w:rPr>
+        <w:t>Tier 1 — reactive AI</w:t>
+      </w:r>
+      <w:r>
+        <w:t xml:space="preserve"> (common enemies) Enemies respond to their own status effects. A burning enemy moves erratically and spreads fire by walking near others. A frozen enemy is helpless. A slowed enemy tries to attack from range if they have a ranged attack. This is the baseline — even dumb enemies feel dynamic if their status responses are well-designed.</w:t>
+      </w:r>
+    </w:p>
+    <w:p>
+      <w:r>
+        <w:rPr>
+          <w:b/>
+          <w:bCs/>
+        </w:rPr>
+        <w:t>Tier 2 — tactical AI</w:t>
+      </w:r>
+      <w:r>
+        <w:t xml:space="preserve"> (elite enemies) Enemies read the terrain and use it deliberately. A fire-immune enemy will deliberately walk through oil slicks to ignite them under the player. A heavy enemy will try to push the player into lava or mud. Enemies with shields will use elevated ground to force the player up a choke ramp. This tier requires pathfinding that's terrain-aware, not just obstacle-aware.</w:t>
+      </w:r>
+    </w:p>
+    <w:p>
+      <w:r>
+        <w:rPr>
+          <w:b/>
+          <w:bCs/>
+        </w:rPr>
+        <w:t>Tier 3 — coordinated AI</w:t>
+      </w:r>
+      <w:r>
+        <w:t xml:space="preserve"> (rare, boss-adjacent) Enemy groups act as a unit. One enemy applies freeze while another follows up with physical hits to trigger shatters. A support enemy periodically clears status effects from nearby allies. A caller enemy raises an alarm that triggers reinforcements from adjacent rooms if not killed first. This </w:t>
+      </w:r>
+      <w:proofErr w:type="gramStart"/>
+      <w:r>
+        <w:t>tier</w:t>
+      </w:r>
+      <w:proofErr w:type="gramEnd"/>
+      <w:r>
+        <w:t xml:space="preserve"> is what makes the player feel like they're fighting an organized threat rather than a crowd.</w:t>
+      </w:r>
+    </w:p>
+    <w:p>
+      <w:r>
+        <w:pict w14:anchorId="40532620">
+          <v:rect id="_x0000_i1027" style="width:0;height:1.5pt" o:hralign="center" o:hrstd="t" o:hr="t" fillcolor="#a0a0a0" stroked="f"/>
+        </w:pict>
+      </w:r>
+    </w:p>
+    <w:p>
+      <w:pPr>
+        <w:rPr>
+          <w:b/>
+          <w:bCs/>
+        </w:rPr>
+      </w:pPr>
+      <w:r>
+        <w:rPr>
+          <w:b/>
+          <w:bCs/>
+        </w:rPr>
+        <w:t>Tying it all together</w:t>
+      </w:r>
+    </w:p>
+    <w:p>
+      <w:r>
         <w:lastRenderedPageBreak/>
-        <w:t>Tier 1 — reactive AI</w:t>
-      </w:r>
-      <w:r>
-        <w:t xml:space="preserve"> (common enemies) Enemies respond to their own status effects. A burning enemy moves erratically and spreads fire by walking near others. A frozen enemy is helpless. A slowed enemy tries to attack from range if they have a ranged attack. This is the baseline — even dumb enemies feel dynamic if their status responses are well-designed.</w:t>
-      </w:r>
-    </w:p>
-    <w:p>
-      <w:r>
-        <w:rPr>
-          <w:b/>
-          <w:bCs/>
-        </w:rPr>
-        <w:t>Tier 2 — tactical AI</w:t>
-      </w:r>
-      <w:r>
-        <w:t xml:space="preserve"> (elite enemies) Enemies read the terrain and use it deliberately. A fire-immune enemy will deliberately walk through oil slicks to ignite them under the player. A heavy enemy will try to push the player into lava or mud. Enemies with shields will use elevated ground to force the player up a choke ramp. This tier requires pathfinding that's terrain-aware, not just obstacle-aware.</w:t>
-      </w:r>
-    </w:p>
-    <w:p>
-      <w:r>
-        <w:rPr>
-          <w:b/>
-          <w:bCs/>
-        </w:rPr>
-        <w:t>Tier 3 — coordinated AI</w:t>
-      </w:r>
-      <w:r>
-        <w:t xml:space="preserve"> (rare, boss-adjacent) Enemy groups act as a unit. One enemy applies freeze while another follows up with physical hits to trigger shatters. A support enemy periodically clears status effects from nearby allies. A caller enemy raises an alarm that triggers reinforcements from adjacent rooms if not killed first. This tier is what makes the player feel like they're fighting an organized threat rather than a crowd.</w:t>
-      </w:r>
-    </w:p>
-    <w:p>
-      <w:r>
-        <w:pict w14:anchorId="40532620">
-          <v:rect id="_x0000_i1045" style="width:0;height:1.5pt" o:hralign="center" o:hrstd="t" o:hr="t" fillcolor="#a0a0a0" stroked="f"/>
-        </w:pict>
-      </w:r>
-    </w:p>
-    <w:p>
-      <w:pPr>
-        <w:rPr>
-          <w:b/>
-          <w:bCs/>
-        </w:rPr>
-      </w:pPr>
-      <w:r>
-        <w:rPr>
-          <w:b/>
-          <w:bCs/>
-        </w:rPr>
-        <w:t>Tying it all together</w:t>
-      </w:r>
-    </w:p>
-    <w:p>
-      <w:r>
-        <w:t>The real payoff is when all three systems create emergent moments the designer didn't explicitly script. A player kites a burning enemy across an oil slick they didn't place intentionally, accidentally igniting half the room. A frozen enemy slides on ice into a lava channel. A Tier 2 AI pushes the player onto a pressure plate that drops a cage — trapping both of them inside together.</w:t>
+        <w:t xml:space="preserve">The real payoff is when all three systems create emergent moments the designer didn't explicitly script. A player kites a burning enemy across an oil slick they didn't place intentionally, accidentally igniting half the room. A frozen enemy slides on ice into a lava channel. A Tier 2 AI pushes the player onto a pressure plate that drops a cage — trapping </w:t>
+      </w:r>
+      <w:proofErr w:type="gramStart"/>
+      <w:r>
+        <w:t>both of them</w:t>
+      </w:r>
+      <w:proofErr w:type="gramEnd"/>
+      <w:r>
+        <w:t xml:space="preserve"> inside together.</w:t>
       </w:r>
     </w:p>
     <w:p>
@@ -2153,6 +2661,155 @@
     </w:lvl>
   </w:abstractNum>
   <w:abstractNum w:abstractNumId="3" w15:restartNumberingAfterBreak="0">
+    <w:nsid w:val="166C5E4E"/>
+    <w:multiLevelType w:val="multilevel"/>
+    <w:tmpl w:val="6666CDB0"/>
+    <w:lvl w:ilvl="0">
+      <w:start w:val="1"/>
+      <w:numFmt w:val="bullet"/>
+      <w:lvlText w:val=""/>
+      <w:lvlJc w:val="left"/>
+      <w:pPr>
+        <w:tabs>
+          <w:tab w:val="num" w:pos="720"/>
+        </w:tabs>
+        <w:ind w:left="720" w:hanging="360"/>
+      </w:pPr>
+      <w:rPr>
+        <w:rFonts w:ascii="Symbol" w:hAnsi="Symbol" w:hint="default"/>
+        <w:sz w:val="20"/>
+      </w:rPr>
+    </w:lvl>
+    <w:lvl w:ilvl="1" w:tentative="1">
+      <w:start w:val="1"/>
+      <w:numFmt w:val="bullet"/>
+      <w:lvlText w:val="o"/>
+      <w:lvlJc w:val="left"/>
+      <w:pPr>
+        <w:tabs>
+          <w:tab w:val="num" w:pos="1440"/>
+        </w:tabs>
+        <w:ind w:left="1440" w:hanging="360"/>
+      </w:pPr>
+      <w:rPr>
+        <w:rFonts w:ascii="Courier New" w:hAnsi="Courier New" w:hint="default"/>
+        <w:sz w:val="20"/>
+      </w:rPr>
+    </w:lvl>
+    <w:lvl w:ilvl="2" w:tentative="1">
+      <w:start w:val="1"/>
+      <w:numFmt w:val="bullet"/>
+      <w:lvlText w:val=""/>
+      <w:lvlJc w:val="left"/>
+      <w:pPr>
+        <w:tabs>
+          <w:tab w:val="num" w:pos="2160"/>
+        </w:tabs>
+        <w:ind w:left="2160" w:hanging="360"/>
+      </w:pPr>
+      <w:rPr>
+        <w:rFonts w:ascii="Wingdings" w:hAnsi="Wingdings" w:hint="default"/>
+        <w:sz w:val="20"/>
+      </w:rPr>
+    </w:lvl>
+    <w:lvl w:ilvl="3" w:tentative="1">
+      <w:start w:val="1"/>
+      <w:numFmt w:val="bullet"/>
+      <w:lvlText w:val=""/>
+      <w:lvlJc w:val="left"/>
+      <w:pPr>
+        <w:tabs>
+          <w:tab w:val="num" w:pos="2880"/>
+        </w:tabs>
+        <w:ind w:left="2880" w:hanging="360"/>
+      </w:pPr>
+      <w:rPr>
+        <w:rFonts w:ascii="Wingdings" w:hAnsi="Wingdings" w:hint="default"/>
+        <w:sz w:val="20"/>
+      </w:rPr>
+    </w:lvl>
+    <w:lvl w:ilvl="4" w:tentative="1">
+      <w:start w:val="1"/>
+      <w:numFmt w:val="bullet"/>
+      <w:lvlText w:val=""/>
+      <w:lvlJc w:val="left"/>
+      <w:pPr>
+        <w:tabs>
+          <w:tab w:val="num" w:pos="3600"/>
+        </w:tabs>
+        <w:ind w:left="3600" w:hanging="360"/>
+      </w:pPr>
+      <w:rPr>
+        <w:rFonts w:ascii="Wingdings" w:hAnsi="Wingdings" w:hint="default"/>
+        <w:sz w:val="20"/>
+      </w:rPr>
+    </w:lvl>
+    <w:lvl w:ilvl="5" w:tentative="1">
+      <w:start w:val="1"/>
+      <w:numFmt w:val="bullet"/>
+      <w:lvlText w:val=""/>
+      <w:lvlJc w:val="left"/>
+      <w:pPr>
+        <w:tabs>
+          <w:tab w:val="num" w:pos="4320"/>
+        </w:tabs>
+        <w:ind w:left="4320" w:hanging="360"/>
+      </w:pPr>
+      <w:rPr>
+        <w:rFonts w:ascii="Wingdings" w:hAnsi="Wingdings" w:hint="default"/>
+        <w:sz w:val="20"/>
+      </w:rPr>
+    </w:lvl>
+    <w:lvl w:ilvl="6" w:tentative="1">
+      <w:start w:val="1"/>
+      <w:numFmt w:val="bullet"/>
+      <w:lvlText w:val=""/>
+      <w:lvlJc w:val="left"/>
+      <w:pPr>
+        <w:tabs>
+          <w:tab w:val="num" w:pos="5040"/>
+        </w:tabs>
+        <w:ind w:left="5040" w:hanging="360"/>
+      </w:pPr>
+      <w:rPr>
+        <w:rFonts w:ascii="Wingdings" w:hAnsi="Wingdings" w:hint="default"/>
+        <w:sz w:val="20"/>
+      </w:rPr>
+    </w:lvl>
+    <w:lvl w:ilvl="7" w:tentative="1">
+      <w:start w:val="1"/>
+      <w:numFmt w:val="bullet"/>
+      <w:lvlText w:val=""/>
+      <w:lvlJc w:val="left"/>
+      <w:pPr>
+        <w:tabs>
+          <w:tab w:val="num" w:pos="5760"/>
+        </w:tabs>
+        <w:ind w:left="5760" w:hanging="360"/>
+      </w:pPr>
+      <w:rPr>
+        <w:rFonts w:ascii="Wingdings" w:hAnsi="Wingdings" w:hint="default"/>
+        <w:sz w:val="20"/>
+      </w:rPr>
+    </w:lvl>
+    <w:lvl w:ilvl="8" w:tentative="1">
+      <w:start w:val="1"/>
+      <w:numFmt w:val="bullet"/>
+      <w:lvlText w:val=""/>
+      <w:lvlJc w:val="left"/>
+      <w:pPr>
+        <w:tabs>
+          <w:tab w:val="num" w:pos="6480"/>
+        </w:tabs>
+        <w:ind w:left="6480" w:hanging="360"/>
+      </w:pPr>
+      <w:rPr>
+        <w:rFonts w:ascii="Wingdings" w:hAnsi="Wingdings" w:hint="default"/>
+        <w:sz w:val="20"/>
+      </w:rPr>
+    </w:lvl>
+  </w:abstractNum>
+  <w:abstractNum w:abstractNumId="4" w15:restartNumberingAfterBreak="0">
     <w:nsid w:val="177C371A"/>
     <w:multiLevelType w:val="multilevel"/>
     <w:tmpl w:val="47ACE154"/>
@@ -2301,7 +2958,7 @@
       </w:rPr>
     </w:lvl>
   </w:abstractNum>
-  <w:abstractNum w:abstractNumId="4" w15:restartNumberingAfterBreak="0">
+  <w:abstractNum w:abstractNumId="5" w15:restartNumberingAfterBreak="0">
     <w:nsid w:val="247561C6"/>
     <w:multiLevelType w:val="multilevel"/>
     <w:tmpl w:val="6DB6466E"/>
@@ -2450,7 +3107,7 @@
       </w:rPr>
     </w:lvl>
   </w:abstractNum>
-  <w:abstractNum w:abstractNumId="5" w15:restartNumberingAfterBreak="0">
+  <w:abstractNum w:abstractNumId="6" w15:restartNumberingAfterBreak="0">
     <w:nsid w:val="26C17C97"/>
     <w:multiLevelType w:val="multilevel"/>
     <w:tmpl w:val="1E482490"/>
@@ -2599,7 +3256,7 @@
       </w:rPr>
     </w:lvl>
   </w:abstractNum>
-  <w:abstractNum w:abstractNumId="6" w15:restartNumberingAfterBreak="0">
+  <w:abstractNum w:abstractNumId="7" w15:restartNumberingAfterBreak="0">
     <w:nsid w:val="28673F30"/>
     <w:multiLevelType w:val="multilevel"/>
     <w:tmpl w:val="C15432F4"/>
@@ -2748,7 +3405,7 @@
       </w:rPr>
     </w:lvl>
   </w:abstractNum>
-  <w:abstractNum w:abstractNumId="7" w15:restartNumberingAfterBreak="0">
+  <w:abstractNum w:abstractNumId="8" w15:restartNumberingAfterBreak="0">
     <w:nsid w:val="3C303268"/>
     <w:multiLevelType w:val="multilevel"/>
     <w:tmpl w:val="D5E407A8"/>
@@ -2897,7 +3554,7 @@
       </w:rPr>
     </w:lvl>
   </w:abstractNum>
-  <w:abstractNum w:abstractNumId="8" w15:restartNumberingAfterBreak="0">
+  <w:abstractNum w:abstractNumId="9" w15:restartNumberingAfterBreak="0">
     <w:nsid w:val="3CC33CF1"/>
     <w:multiLevelType w:val="multilevel"/>
     <w:tmpl w:val="6D04A344"/>
@@ -3046,7 +3703,7 @@
       </w:rPr>
     </w:lvl>
   </w:abstractNum>
-  <w:abstractNum w:abstractNumId="9" w15:restartNumberingAfterBreak="0">
+  <w:abstractNum w:abstractNumId="10" w15:restartNumberingAfterBreak="0">
     <w:nsid w:val="497A07CC"/>
     <w:multiLevelType w:val="multilevel"/>
     <w:tmpl w:val="8EDABDC4"/>
@@ -3195,7 +3852,7 @@
       </w:rPr>
     </w:lvl>
   </w:abstractNum>
-  <w:abstractNum w:abstractNumId="10" w15:restartNumberingAfterBreak="0">
+  <w:abstractNum w:abstractNumId="11" w15:restartNumberingAfterBreak="0">
     <w:nsid w:val="5C7E0AFF"/>
     <w:multiLevelType w:val="multilevel"/>
     <w:tmpl w:val="2084F02A"/>
@@ -3344,7 +4001,7 @@
       </w:rPr>
     </w:lvl>
   </w:abstractNum>
-  <w:abstractNum w:abstractNumId="11" w15:restartNumberingAfterBreak="0">
+  <w:abstractNum w:abstractNumId="12" w15:restartNumberingAfterBreak="0">
     <w:nsid w:val="6B1E2864"/>
     <w:multiLevelType w:val="multilevel"/>
     <w:tmpl w:val="80EC3D06"/>
@@ -3493,7 +4150,7 @@
       </w:rPr>
     </w:lvl>
   </w:abstractNum>
-  <w:abstractNum w:abstractNumId="12" w15:restartNumberingAfterBreak="0">
+  <w:abstractNum w:abstractNumId="13" w15:restartNumberingAfterBreak="0">
     <w:nsid w:val="6E1D11F2"/>
     <w:multiLevelType w:val="multilevel"/>
     <w:tmpl w:val="6C847B6A"/>
@@ -3643,43 +4300,46 @@
     </w:lvl>
   </w:abstractNum>
   <w:num w:numId="1" w16cid:durableId="88158391">
-    <w:abstractNumId w:val="3"/>
+    <w:abstractNumId w:val="4"/>
   </w:num>
   <w:num w:numId="2" w16cid:durableId="1956402563">
     <w:abstractNumId w:val="1"/>
   </w:num>
   <w:num w:numId="3" w16cid:durableId="1790926387">
+    <w:abstractNumId w:val="9"/>
+  </w:num>
+  <w:num w:numId="4" w16cid:durableId="336659417">
+    <w:abstractNumId w:val="6"/>
+  </w:num>
+  <w:num w:numId="5" w16cid:durableId="454174107">
     <w:abstractNumId w:val="8"/>
   </w:num>
-  <w:num w:numId="4" w16cid:durableId="336659417">
-    <w:abstractNumId w:val="5"/>
+  <w:num w:numId="6" w16cid:durableId="1052194032">
+    <w:abstractNumId w:val="12"/>
   </w:num>
-  <w:num w:numId="5" w16cid:durableId="454174107">
-    <w:abstractNumId w:val="7"/>
-  </w:num>
-  <w:num w:numId="6" w16cid:durableId="1052194032">
+  <w:num w:numId="7" w16cid:durableId="119617330">
     <w:abstractNumId w:val="11"/>
   </w:num>
-  <w:num w:numId="7" w16cid:durableId="119617330">
-    <w:abstractNumId w:val="10"/>
-  </w:num>
   <w:num w:numId="8" w16cid:durableId="375934767">
-    <w:abstractNumId w:val="6"/>
+    <w:abstractNumId w:val="7"/>
   </w:num>
   <w:num w:numId="9" w16cid:durableId="581372556">
     <w:abstractNumId w:val="0"/>
   </w:num>
   <w:num w:numId="10" w16cid:durableId="1544512519">
-    <w:abstractNumId w:val="9"/>
+    <w:abstractNumId w:val="10"/>
   </w:num>
   <w:num w:numId="11" w16cid:durableId="1004361518">
-    <w:abstractNumId w:val="4"/>
+    <w:abstractNumId w:val="5"/>
   </w:num>
   <w:num w:numId="12" w16cid:durableId="57947482">
     <w:abstractNumId w:val="2"/>
   </w:num>
   <w:num w:numId="13" w16cid:durableId="36199188">
-    <w:abstractNumId w:val="12"/>
+    <w:abstractNumId w:val="13"/>
+  </w:num>
+  <w:num w:numId="14" w16cid:durableId="989792294">
+    <w:abstractNumId w:val="3"/>
   </w:num>
 </w:numbering>
 </file>

</xml_diff>